<commit_message>
Embed Supabase model registry, GitHub Actions CI/CD history, and Streamlit dashboard screenshots in reports
</commit_message>
<xml_diff>
--- a/Pakistan_AQI_3Day_Predictor_Comprehensive_Report.docx
+++ b/Pakistan_AQI_3Day_Predictor_Comprehensive_Report.docx
@@ -1360,6 +1360,73 @@
         </w:tc>
       </w:tr>
     </w:tbl>
+    <w:p>
+      <w:pPr>
+        <w:pStyle w:val="Heading2"/>
+        <w:keepNext/>
+        <w:spacing w:before="260" w:after="80"/>
+      </w:pPr>
+      <w:r>
+        <w:rPr>
+          <w:color w:val="2874A6"/>
+          <w:sz w:val="26"/>
+        </w:rPr>
+        <w:t>5.1 Cloud Production Model Registry</w:t>
+      </w:r>
+    </w:p>
+    <w:p>
+      <w:r>
+        <w:t>The figure below illustrates the live production Supabase model_registry table, capturing model versioning (from initial baseline experiments through aqi_forecast_xgboost v16), validation RMSE scores, JSONB parameter sets, top-25 global SHAP attributions, and compressed Base64 serialized model payloads:</w:t>
+      </w:r>
+    </w:p>
+    <w:p>
+      <w:r>
+        <w:drawing>
+          <wp:inline xmlns:a="http://schemas.openxmlformats.org/drawingml/2006/main" xmlns:pic="http://schemas.openxmlformats.org/drawingml/2006/picture">
+            <wp:extent cx="5669280" cy="2685157"/>
+            <wp:docPr id="1" name="Picture 1"/>
+            <wp:cNvGraphicFramePr>
+              <a:graphicFrameLocks noChangeAspect="1"/>
+            </wp:cNvGraphicFramePr>
+            <a:graphic>
+              <a:graphicData uri="http://schemas.openxmlformats.org/drawingml/2006/picture">
+                <pic:pic>
+                  <pic:nvPicPr>
+                    <pic:cNvPr id="0" name="supabase_model_registry.png"/>
+                    <pic:cNvPicPr/>
+                  </pic:nvPicPr>
+                  <pic:blipFill>
+                    <a:blip r:embed="rId10"/>
+                    <a:stretch>
+                      <a:fillRect/>
+                    </a:stretch>
+                  </pic:blipFill>
+                  <pic:spPr>
+                    <a:xfrm>
+                      <a:off x="0" y="0"/>
+                      <a:ext cx="5669280" cy="2685157"/>
+                    </a:xfrm>
+                    <a:prstGeom prst="rect"/>
+                  </pic:spPr>
+                </pic:pic>
+              </a:graphicData>
+            </a:graphic>
+          </wp:inline>
+        </w:drawing>
+      </w:r>
+    </w:p>
+    <w:p>
+      <w:pPr>
+        <w:spacing w:after="240"/>
+      </w:pPr>
+      <w:r>
+        <w:rPr>
+          <w:i/>
+          <w:sz w:val="17"/>
+        </w:rPr>
+        <w:t>Figure 5.1: Live Supabase PostgreSQL model_registry table in production.</w:t>
+      </w:r>
+    </w:p>
     <w:p>
       <w:pPr>
         <w:spacing w:after="240"/>
@@ -3317,6 +3384,73 @@
     </w:p>
     <w:p>
       <w:pPr>
+        <w:pStyle w:val="Heading2"/>
+        <w:keepNext/>
+        <w:spacing w:before="260" w:after="80"/>
+      </w:pPr>
+      <w:r>
+        <w:rPr>
+          <w:color w:val="2874A6"/>
+          <w:sz w:val="26"/>
+        </w:rPr>
+        <w:t>8.1 Automated Workflow Execution Telemetry</w:t>
+      </w:r>
+    </w:p>
+    <w:p>
+      <w:r>
+        <w:t>The figure below demonstrates the continuous, autonomous execution history of the production CI/CD workflows on GitHub Actions, showing 52+ consecutive successful runs without human intervention:</w:t>
+      </w:r>
+    </w:p>
+    <w:p>
+      <w:r>
+        <w:drawing>
+          <wp:inline xmlns:a="http://schemas.openxmlformats.org/drawingml/2006/main" xmlns:pic="http://schemas.openxmlformats.org/drawingml/2006/picture">
+            <wp:extent cx="5669280" cy="2801422"/>
+            <wp:docPr id="2" name="Picture 2"/>
+            <wp:cNvGraphicFramePr>
+              <a:graphicFrameLocks noChangeAspect="1"/>
+            </wp:cNvGraphicFramePr>
+            <a:graphic>
+              <a:graphicData uri="http://schemas.openxmlformats.org/drawingml/2006/picture">
+                <pic:pic>
+                  <pic:nvPicPr>
+                    <pic:cNvPr id="0" name="github_actions_pipeline.png"/>
+                    <pic:cNvPicPr/>
+                  </pic:nvPicPr>
+                  <pic:blipFill>
+                    <a:blip r:embed="rId11"/>
+                    <a:stretch>
+                      <a:fillRect/>
+                    </a:stretch>
+                  </pic:blipFill>
+                  <pic:spPr>
+                    <a:xfrm>
+                      <a:off x="0" y="0"/>
+                      <a:ext cx="5669280" cy="2801422"/>
+                    </a:xfrm>
+                    <a:prstGeom prst="rect"/>
+                  </pic:spPr>
+                </pic:pic>
+              </a:graphicData>
+            </a:graphic>
+          </wp:inline>
+        </w:drawing>
+      </w:r>
+    </w:p>
+    <w:p>
+      <w:pPr>
+        <w:spacing w:after="240"/>
+      </w:pPr>
+      <w:r>
+        <w:rPr>
+          <w:i/>
+          <w:sz w:val="17"/>
+        </w:rPr>
+        <w:t>Figure 8.1: Live execution history of automated GitHub Actions pipelines with 52+ consecutive successful scheduled runs.</w:t>
+      </w:r>
+    </w:p>
+    <w:p>
+      <w:pPr>
         <w:pStyle w:val="Heading1"/>
         <w:keepNext/>
         <w:spacing w:before="360" w:after="120"/>
@@ -3372,6 +3506,73 @@
         <w:t xml:space="preserve">  - Tab 4: 📊 Model Performance &amp; Benchmarks: Full benchmark evaluation tables and per-city metrics.</w:t>
         <w:br/>
         <w:t xml:space="preserve">  - Tab 5: 📋 Live Feature Store Inspector: Searchable, filterable real-time table queried directly from Supabase PostgreSQL.</w:t>
+      </w:r>
+    </w:p>
+    <w:p>
+      <w:pPr>
+        <w:pStyle w:val="Heading2"/>
+        <w:keepNext/>
+        <w:spacing w:before="260" w:after="80"/>
+      </w:pPr>
+      <w:r>
+        <w:rPr>
+          <w:color w:val="2874A6"/>
+          <w:sz w:val="26"/>
+        </w:rPr>
+        <w:t>9.1 Live Production Dashboard Interface</w:t>
+      </w:r>
+    </w:p>
+    <w:p>
+      <w:r>
+        <w:t>The figure below shows the live operational web interface running on Streamlit Community Cloud, featuring real-time Karachi atmospheric telemetry in the sidebar, EPA Health Alert Advisory, 4-card metric KPI ribbon, active champion model tag (aqi_forecast_xgboost v16), and interactive 3-day forecast trajectory:</w:t>
+      </w:r>
+    </w:p>
+    <w:p>
+      <w:r>
+        <w:drawing>
+          <wp:inline xmlns:a="http://schemas.openxmlformats.org/drawingml/2006/main" xmlns:pic="http://schemas.openxmlformats.org/drawingml/2006/picture">
+            <wp:extent cx="5669280" cy="2773740"/>
+            <wp:docPr id="3" name="Picture 3"/>
+            <wp:cNvGraphicFramePr>
+              <a:graphicFrameLocks noChangeAspect="1"/>
+            </wp:cNvGraphicFramePr>
+            <a:graphic>
+              <a:graphicData uri="http://schemas.openxmlformats.org/drawingml/2006/picture">
+                <pic:pic>
+                  <pic:nvPicPr>
+                    <pic:cNvPr id="0" name="streamlit_dashboard.png"/>
+                    <pic:cNvPicPr/>
+                  </pic:nvPicPr>
+                  <pic:blipFill>
+                    <a:blip r:embed="rId12"/>
+                    <a:stretch>
+                      <a:fillRect/>
+                    </a:stretch>
+                  </pic:blipFill>
+                  <pic:spPr>
+                    <a:xfrm>
+                      <a:off x="0" y="0"/>
+                      <a:ext cx="5669280" cy="2773740"/>
+                    </a:xfrm>
+                    <a:prstGeom prst="rect"/>
+                  </pic:spPr>
+                </pic:pic>
+              </a:graphicData>
+            </a:graphic>
+          </wp:inline>
+        </w:drawing>
+      </w:r>
+    </w:p>
+    <w:p>
+      <w:pPr>
+        <w:spacing w:after="240"/>
+      </w:pPr>
+      <w:r>
+        <w:rPr>
+          <w:i/>
+          <w:sz w:val="17"/>
+        </w:rPr>
+        <w:t>Figure 9.1: Live Streamlit production dashboard showing Karachi live telemetry, EPA health advisory banner, 4-card KPI ribbon, active champion model aqi_forecast_xgboost v16, and Tab 1 continuous 3-day forecasting trends.</w:t>
       </w:r>
     </w:p>
     <w:p>

</xml_diff>